<commit_message>
feat: Add product image uploads, order timeline, and inventory management
</commit_message>
<xml_diff>
--- a/GramConnect_Report.docx
+++ b/GramConnect_Report.docx
@@ -4625,15 +4625,7 @@
           <w:bCs/>
         </w:rPr>
         <w:lastRenderedPageBreak/>
-        <w:t xml:space="preserve">Chapter – </w:t>
-      </w:r>
-      <w:r>
-        <w:rPr>
-          <w:rFonts w:ascii="Times New Roman" w:hAnsi="Times New Roman" w:cs="Times New Roman"/>
-          <w:b/>
-          <w:bCs/>
-        </w:rPr>
-        <w:t>5</w:t>
+        <w:t>Chapter – 5</w:t>
       </w:r>
     </w:p>
     <w:p>
@@ -6152,9 +6144,10 @@
           <w:rFonts w:ascii="Times New Roman" w:hAnsi="Times New Roman" w:cs="Times New Roman"/>
           <w:i/>
           <w:iCs/>
+          <w:noProof/>
         </w:rPr>
         <w:drawing>
-          <wp:anchor distT="0" distB="0" distL="114300" distR="114300" simplePos="0" relativeHeight="251680768" behindDoc="0" locked="0" layoutInCell="1" allowOverlap="1" wp14:anchorId="12CBF495" wp14:editId="48FF4E83">
+          <wp:anchor distT="0" distB="0" distL="114300" distR="114300" simplePos="0" relativeHeight="251680768" behindDoc="0" locked="0" layoutInCell="1" allowOverlap="1" wp14:anchorId="12CBF495" wp14:editId="2EDF4710">
             <wp:simplePos x="0" y="0"/>
             <wp:positionH relativeFrom="margin">
               <wp:posOffset>-228600</wp:posOffset>
@@ -6274,6 +6267,7 @@
           <w:rFonts w:ascii="Times New Roman" w:hAnsi="Times New Roman" w:cs="Times New Roman"/>
           <w:i/>
           <w:iCs/>
+          <w:noProof/>
         </w:rPr>
         <w:drawing>
           <wp:anchor distT="0" distB="0" distL="114300" distR="114300" simplePos="0" relativeHeight="251681792" behindDoc="0" locked="0" layoutInCell="1" allowOverlap="1" wp14:anchorId="15E6DF64" wp14:editId="15646EE7">
@@ -6420,10 +6414,11 @@
           <w:rFonts w:ascii="Times New Roman" w:hAnsi="Times New Roman" w:cs="Times New Roman"/>
           <w:i/>
           <w:iCs/>
+          <w:noProof/>
         </w:rPr>
         <w:lastRenderedPageBreak/>
         <w:drawing>
-          <wp:anchor distT="0" distB="0" distL="114300" distR="114300" simplePos="0" relativeHeight="251682816" behindDoc="1" locked="0" layoutInCell="1" allowOverlap="1" wp14:anchorId="40EA8DB0" wp14:editId="3256CA53">
+          <wp:anchor distT="0" distB="0" distL="114300" distR="114300" simplePos="0" relativeHeight="251682816" behindDoc="1" locked="0" layoutInCell="1" allowOverlap="1" wp14:anchorId="40EA8DB0" wp14:editId="4C3881FB">
             <wp:simplePos x="0" y="0"/>
             <wp:positionH relativeFrom="margin">
               <wp:align>center</wp:align>
@@ -6857,6 +6852,7 @@
       <w:r>
         <w:rPr>
           <w:rFonts w:ascii="Times New Roman" w:hAnsi="Times New Roman" w:cs="Times New Roman"/>
+          <w:noProof/>
         </w:rPr>
         <w:drawing>
           <wp:anchor distT="0" distB="0" distL="114300" distR="114300" simplePos="0" relativeHeight="251686912" behindDoc="0" locked="0" layoutInCell="1" allowOverlap="1" wp14:anchorId="4BE2324B" wp14:editId="4E7A9E74">
@@ -6988,6 +6984,7 @@
       <w:r>
         <w:rPr>
           <w:rFonts w:ascii="Times New Roman" w:hAnsi="Times New Roman" w:cs="Times New Roman"/>
+          <w:noProof/>
         </w:rPr>
         <w:drawing>
           <wp:anchor distT="0" distB="0" distL="114300" distR="114300" simplePos="0" relativeHeight="251688960" behindDoc="0" locked="0" layoutInCell="1" allowOverlap="1" wp14:anchorId="584EACC5" wp14:editId="475CCEE9">
@@ -7568,19 +7565,7 @@
         <w:rPr>
           <w:rFonts w:ascii="Times New Roman" w:hAnsi="Times New Roman" w:cs="Times New Roman"/>
         </w:rPr>
-        <w:t xml:space="preserve">System testing ensures that the entire integrated software system meets requirements. It tests a configuration to ensure known and predictable results. An example of system testing is the </w:t>
-      </w:r>
-      <w:r>
-        <w:rPr>
-          <w:rFonts w:ascii="Times New Roman" w:hAnsi="Times New Roman" w:cs="Times New Roman"/>
-        </w:rPr>
-        <w:t>configuration-oriented</w:t>
-      </w:r>
-      <w:r>
-        <w:rPr>
-          <w:rFonts w:ascii="Times New Roman" w:hAnsi="Times New Roman" w:cs="Times New Roman"/>
-        </w:rPr>
-        <w:t xml:space="preserve"> system integration test. System testing is based on process descriptions and flows, emphasizing pre-driven process links and integration points.</w:t>
+        <w:t>System testing ensures that the entire integrated software system meets requirements. It tests a configuration to ensure known and predictable results. An example of system testing is the configuration-oriented system integration test. System testing is based on process descriptions and flows, emphasizing pre-driven process links and integration points.</w:t>
       </w:r>
     </w:p>
     <w:p>
@@ -9058,58 +9043,11 @@
 
 <file path=word/header2.xml><?xml version="1.0" encoding="utf-8"?>
 <w:hdr xmlns:wpc="http://schemas.microsoft.com/office/word/2010/wordprocessingCanvas" xmlns:cx="http://schemas.microsoft.com/office/drawing/2014/chartex" xmlns:cx1="http://schemas.microsoft.com/office/drawing/2015/9/8/chartex" xmlns:cx2="http://schemas.microsoft.com/office/drawing/2015/10/21/chartex" xmlns:cx3="http://schemas.microsoft.com/office/drawing/2016/5/9/chartex" xmlns:cx4="http://schemas.microsoft.com/office/drawing/2016/5/10/chartex" xmlns:cx5="http://schemas.microsoft.com/office/drawing/2016/5/11/chartex" xmlns:cx6="http://schemas.microsoft.com/office/drawing/2016/5/12/chartex" xmlns:cx7="http://schemas.microsoft.com/office/drawing/2016/5/13/chartex" xmlns:cx8="http://schemas.microsoft.com/office/drawing/2016/5/14/chartex" xmlns:mc="http://schemas.openxmlformats.org/markup-compatibility/2006" xmlns:aink="http://schemas.microsoft.com/office/drawing/2016/ink" xmlns:am3d="http://schemas.microsoft.com/office/drawing/2017/model3d" xmlns:o="urn:schemas-microsoft-com:office:office" xmlns:oel="http://schemas.microsoft.com/office/2019/extlst" xmlns:r="http://schemas.openxmlformats.org/officeDocument/2006/relationships" xmlns:m="http://schemas.openxmlformats.org/officeDocument/2006/math" xmlns:v="urn:schemas-microsoft-com:vml" xmlns:wp14="http://schemas.microsoft.com/office/word/2010/wordprocessingDrawing" xmlns:wp="http://schemas.openxmlformats.org/drawingml/2006/wordprocessingDrawing" xmlns:w10="urn:schemas-microsoft-com:office:word" xmlns:w="http://schemas.openxmlformats.org/wordprocessingml/2006/main" xmlns:w14="http://schemas.microsoft.com/office/word/2010/wordml" xmlns:w15="http://schemas.microsoft.com/office/word/2012/wordml" xmlns:w16cex="http://schemas.microsoft.com/office/word/2018/wordml/cex" xmlns:w16cid="http://schemas.microsoft.com/office/word/2016/wordml/cid" xmlns:w16="http://schemas.microsoft.com/office/word/2018/wordml" xmlns:w16du="http://schemas.microsoft.com/office/word/2023/wordml/word16du" xmlns:w16sdtdh="http://schemas.microsoft.com/office/word/2020/wordml/sdtdatahash" xmlns:w16sdtfl="http://schemas.microsoft.com/office/word/2024/wordml/sdtformatlock" xmlns:w16se="http://schemas.microsoft.com/office/word/2015/wordml/symex" xmlns:wpg="http://schemas.microsoft.com/office/word/2010/wordprocessingGroup" xmlns:wpi="http://schemas.microsoft.com/office/word/2010/wordprocessingInk" xmlns:wne="http://schemas.microsoft.com/office/word/2006/wordml" xmlns:wps="http://schemas.microsoft.com/office/word/2010/wordprocessingShape" mc:Ignorable="w14 w15 w16se w16cid w16 w16cex w16sdtdh w16sdtfl w16du wp14">
-  <w:sdt>
-    <w:sdtPr>
-      <w:id w:val="-966664557"/>
-      <w:docPartObj>
-        <w:docPartGallery w:val="Watermarks"/>
-        <w:docPartUnique/>
-      </w:docPartObj>
-    </w:sdtPr>
-    <w:sdtContent>
-      <w:p>
-        <w:pPr>
-          <w:pStyle w:val="Header"/>
-        </w:pPr>
-        <w:r>
-          <w:rPr>
-            <w:noProof/>
-          </w:rPr>
-          <w:pict w14:anchorId="23FFE75A">
-            <v:shapetype id="_x0000_t136" coordsize="21600,21600" o:spt="136" adj="10800" path="m@7,l@8,m@5,21600l@6,21600e">
-              <v:formulas>
-                <v:f eqn="sum #0 0 10800"/>
-                <v:f eqn="prod #0 2 1"/>
-                <v:f eqn="sum 21600 0 @1"/>
-                <v:f eqn="sum 0 0 @2"/>
-                <v:f eqn="sum 21600 0 @3"/>
-                <v:f eqn="if @0 @3 0"/>
-                <v:f eqn="if @0 21600 @1"/>
-                <v:f eqn="if @0 0 @2"/>
-                <v:f eqn="if @0 @4 21600"/>
-                <v:f eqn="mid @5 @6"/>
-                <v:f eqn="mid @8 @5"/>
-                <v:f eqn="mid @7 @8"/>
-                <v:f eqn="mid @6 @7"/>
-                <v:f eqn="sum @6 0 @5"/>
-              </v:formulas>
-              <v:path textpathok="t" o:connecttype="custom" o:connectlocs="@9,0;@10,10800;@11,21600;@12,10800" o:connectangles="270,180,90,0"/>
-              <v:textpath on="t" fitshape="t"/>
-              <v:handles>
-                <v:h position="#0,bottomRight" xrange="6629,14971"/>
-              </v:handles>
-              <o:lock v:ext="edit" text="t" shapetype="t"/>
-            </v:shapetype>
-            <v:shape id="PowerPlusWaterMarkObject184608345" o:spid="_x0000_s1026" type="#_x0000_t136" style="position:absolute;margin-left:0;margin-top:0;width:397.65pt;height:238.6pt;rotation:315;z-index:-251657216;mso-position-horizontal:center;mso-position-horizontal-relative:margin;mso-position-vertical:center;mso-position-vertical-relative:margin" o:allowincell="f" fillcolor="#d8d8d8 [2732]" stroked="f">
-              <v:fill opacity=".5"/>
-              <v:textpath style="font-family:&quot;Calibri&quot;;font-size:1pt" string="DRAFT"/>
-              <w10:wrap anchorx="margin" anchory="margin"/>
-            </v:shape>
-          </w:pict>
-        </w:r>
-      </w:p>
-    </w:sdtContent>
-  </w:sdt>
+  <w:p>
+    <w:pPr>
+      <w:pStyle w:val="Header"/>
+    </w:pPr>
+  </w:p>
 </w:hdr>
 </file>
 
@@ -13573,6 +13511,7 @@
   <w:style w:type="character" w:default="1" w:styleId="DefaultParagraphFont">
     <w:name w:val="Default Paragraph Font"/>
     <w:uiPriority w:val="1"/>
+    <w:semiHidden/>
     <w:unhideWhenUsed/>
   </w:style>
   <w:style w:type="table" w:default="1" w:styleId="TableNormal">

</xml_diff>